<commit_message>
add resume pdf, ignore repo demo account
</commit_message>
<xml_diff>
--- a/Phenphitcha_Phaisan_Resume_QA.docx
+++ b/Phenphitcha_Phaisan_Resume_QA.docx
@@ -131,6 +131,73 @@
       <w:pPr>
         <w:spacing w:after="100"/>
       </w:pPr>
+      <w:r>
+        <w:rPr>
+          <w:b/>
+          <w:bCs/>
+          <w:noProof/>
+          <w:color w:val="000000"/>
+          <w:spacing w:val="20"/>
+          <w:sz w:val="32"/>
+          <w:szCs w:val="32"/>
+        </w:rPr>
+        <w:drawing>
+          <wp:anchor distT="0" distB="0" distL="114300" distR="114300" simplePos="0" relativeHeight="251658240" behindDoc="0" locked="0" layoutInCell="1" allowOverlap="1" wp14:anchorId="3F00E408" wp14:editId="40725171">
+            <wp:simplePos x="0" y="0"/>
+            <wp:positionH relativeFrom="margin">
+              <wp:posOffset>2288540</wp:posOffset>
+            </wp:positionH>
+            <wp:positionV relativeFrom="margin">
+              <wp:posOffset>1010920</wp:posOffset>
+            </wp:positionV>
+            <wp:extent cx="2142490" cy="3009900"/>
+            <wp:effectExtent l="0" t="0" r="0" b="0"/>
+            <wp:wrapNone/>
+            <wp:docPr id="1290979820" name="รูปภาพ 1"/>
+            <wp:cNvGraphicFramePr>
+              <a:graphicFrameLocks xmlns:a="http://schemas.openxmlformats.org/drawingml/2006/main" noChangeAspect="1"/>
+            </wp:cNvGraphicFramePr>
+            <a:graphic xmlns:a="http://schemas.openxmlformats.org/drawingml/2006/main">
+              <a:graphicData uri="http://schemas.openxmlformats.org/drawingml/2006/picture">
+                <pic:pic xmlns:pic="http://schemas.openxmlformats.org/drawingml/2006/picture">
+                  <pic:nvPicPr>
+                    <pic:cNvPr id="1290979820" name="รูปภาพ 1290979820"/>
+                    <pic:cNvPicPr/>
+                  </pic:nvPicPr>
+                  <pic:blipFill>
+                    <a:blip r:embed="rId5">
+                      <a:alphaModFix amt="0"/>
+                      <a:extLst>
+                        <a:ext uri="{28A0092B-C50C-407E-A947-70E740481C1C}">
+                          <a14:useLocalDpi xmlns:a14="http://schemas.microsoft.com/office/drawing/2010/main" val="0"/>
+                        </a:ext>
+                      </a:extLst>
+                    </a:blip>
+                    <a:stretch>
+                      <a:fillRect/>
+                    </a:stretch>
+                  </pic:blipFill>
+                  <pic:spPr>
+                    <a:xfrm>
+                      <a:off x="0" y="0"/>
+                      <a:ext cx="2142490" cy="3009900"/>
+                    </a:xfrm>
+                    <a:prstGeom prst="rect">
+                      <a:avLst/>
+                    </a:prstGeom>
+                  </pic:spPr>
+                </pic:pic>
+              </a:graphicData>
+            </a:graphic>
+            <wp14:sizeRelH relativeFrom="margin">
+              <wp14:pctWidth>0</wp14:pctWidth>
+            </wp14:sizeRelH>
+            <wp14:sizeRelV relativeFrom="margin">
+              <wp14:pctHeight>0</wp14:pctHeight>
+            </wp14:sizeRelV>
+          </wp:anchor>
+        </w:drawing>
+      </w:r>
       <w:r>
         <w:rPr>
           <w:color w:val="1A1A1A"/>
@@ -429,6 +496,71 @@
       </w:pPr>
       <w:r>
         <w:rPr>
+          <w:rFonts w:asciiTheme="minorHAnsi" w:hAnsiTheme="minorHAnsi" w:cstheme="minorHAnsi"/>
+          <w:noProof/>
+          <w:color w:val="1A1A1A"/>
+          <w:sz w:val="20"/>
+          <w:szCs w:val="20"/>
+        </w:rPr>
+        <w:drawing>
+          <wp:anchor distT="0" distB="0" distL="114300" distR="114300" simplePos="0" relativeHeight="251659264" behindDoc="0" locked="0" layoutInCell="1" allowOverlap="1" wp14:anchorId="4CEBD5C5" wp14:editId="242FD42F">
+            <wp:simplePos x="0" y="0"/>
+            <wp:positionH relativeFrom="column">
+              <wp:posOffset>-35560</wp:posOffset>
+            </wp:positionH>
+            <wp:positionV relativeFrom="paragraph">
+              <wp:posOffset>38100</wp:posOffset>
+            </wp:positionV>
+            <wp:extent cx="2082800" cy="4511040"/>
+            <wp:effectExtent l="0" t="0" r="0" b="0"/>
+            <wp:wrapNone/>
+            <wp:docPr id="2041866285" name="รูปภาพ 2"/>
+            <wp:cNvGraphicFramePr>
+              <a:graphicFrameLocks xmlns:a="http://schemas.openxmlformats.org/drawingml/2006/main" noChangeAspect="1"/>
+            </wp:cNvGraphicFramePr>
+            <a:graphic xmlns:a="http://schemas.openxmlformats.org/drawingml/2006/main">
+              <a:graphicData uri="http://schemas.openxmlformats.org/drawingml/2006/picture">
+                <pic:pic xmlns:pic="http://schemas.openxmlformats.org/drawingml/2006/picture">
+                  <pic:nvPicPr>
+                    <pic:cNvPr id="2041866285" name="รูปภาพ 2041866285"/>
+                    <pic:cNvPicPr/>
+                  </pic:nvPicPr>
+                  <pic:blipFill>
+                    <a:blip r:embed="rId6">
+                      <a:alphaModFix amt="0"/>
+                      <a:extLst>
+                        <a:ext uri="{28A0092B-C50C-407E-A947-70E740481C1C}">
+                          <a14:useLocalDpi xmlns:a14="http://schemas.microsoft.com/office/drawing/2010/main" val="0"/>
+                        </a:ext>
+                      </a:extLst>
+                    </a:blip>
+                    <a:stretch>
+                      <a:fillRect/>
+                    </a:stretch>
+                  </pic:blipFill>
+                  <pic:spPr>
+                    <a:xfrm>
+                      <a:off x="0" y="0"/>
+                      <a:ext cx="2082800" cy="4511040"/>
+                    </a:xfrm>
+                    <a:prstGeom prst="rect">
+                      <a:avLst/>
+                    </a:prstGeom>
+                  </pic:spPr>
+                </pic:pic>
+              </a:graphicData>
+            </a:graphic>
+            <wp14:sizeRelH relativeFrom="page">
+              <wp14:pctWidth>0</wp14:pctWidth>
+            </wp14:sizeRelH>
+            <wp14:sizeRelV relativeFrom="page">
+              <wp14:pctHeight>0</wp14:pctHeight>
+            </wp14:sizeRelV>
+          </wp:anchor>
+        </w:drawing>
+      </w:r>
+      <w:r>
+        <w:rPr>
           <w:color w:val="1A1A1A"/>
           <w:sz w:val="20"/>
           <w:szCs w:val="20"/>
@@ -481,6 +613,67 @@
         </w:numPr>
         <w:spacing w:after="30"/>
       </w:pPr>
+      <w:r>
+        <w:rPr>
+          <w:noProof/>
+        </w:rPr>
+        <w:drawing>
+          <wp:anchor distT="0" distB="0" distL="114300" distR="114300" simplePos="0" relativeHeight="251660288" behindDoc="0" locked="0" layoutInCell="1" allowOverlap="1" wp14:anchorId="67FADD1D" wp14:editId="6BC61FD7">
+            <wp:simplePos x="0" y="0"/>
+            <wp:positionH relativeFrom="column">
+              <wp:posOffset>4140417</wp:posOffset>
+            </wp:positionH>
+            <wp:positionV relativeFrom="paragraph">
+              <wp:posOffset>97155</wp:posOffset>
+            </wp:positionV>
+            <wp:extent cx="1953678" cy="4235632"/>
+            <wp:effectExtent l="0" t="0" r="0" b="0"/>
+            <wp:wrapNone/>
+            <wp:docPr id="2108803887" name="รูปภาพ 3"/>
+            <wp:cNvGraphicFramePr>
+              <a:graphicFrameLocks xmlns:a="http://schemas.openxmlformats.org/drawingml/2006/main" noChangeAspect="1"/>
+            </wp:cNvGraphicFramePr>
+            <a:graphic xmlns:a="http://schemas.openxmlformats.org/drawingml/2006/main">
+              <a:graphicData uri="http://schemas.openxmlformats.org/drawingml/2006/picture">
+                <pic:pic xmlns:pic="http://schemas.openxmlformats.org/drawingml/2006/picture">
+                  <pic:nvPicPr>
+                    <pic:cNvPr id="2108803887" name="รูปภาพ 2108803887"/>
+                    <pic:cNvPicPr/>
+                  </pic:nvPicPr>
+                  <pic:blipFill>
+                    <a:blip r:embed="rId7" cstate="print">
+                      <a:alphaModFix amt="0"/>
+                      <a:extLst>
+                        <a:ext uri="{28A0092B-C50C-407E-A947-70E740481C1C}">
+                          <a14:useLocalDpi xmlns:a14="http://schemas.microsoft.com/office/drawing/2010/main" val="0"/>
+                        </a:ext>
+                      </a:extLst>
+                    </a:blip>
+                    <a:stretch>
+                      <a:fillRect/>
+                    </a:stretch>
+                  </pic:blipFill>
+                  <pic:spPr>
+                    <a:xfrm>
+                      <a:off x="0" y="0"/>
+                      <a:ext cx="1954096" cy="4236538"/>
+                    </a:xfrm>
+                    <a:prstGeom prst="rect">
+                      <a:avLst/>
+                    </a:prstGeom>
+                  </pic:spPr>
+                </pic:pic>
+              </a:graphicData>
+            </a:graphic>
+            <wp14:sizeRelH relativeFrom="page">
+              <wp14:pctWidth>0</wp14:pctWidth>
+            </wp14:sizeRelH>
+            <wp14:sizeRelV relativeFrom="page">
+              <wp14:pctHeight>0</wp14:pctHeight>
+            </wp14:sizeRelV>
+          </wp:anchor>
+        </w:drawing>
+      </w:r>
       <w:proofErr w:type="spellStart"/>
       <w:r>
         <w:rPr>

</xml_diff>

<commit_message>
hide linkedin, fix resume link, add OR-Room repo link and demo account, fix email button
</commit_message>
<xml_diff>
--- a/Phenphitcha_Phaisan_Resume_QA.docx
+++ b/Phenphitcha_Phaisan_Resume_QA.docx
@@ -95,15 +95,7 @@
           <w:sz w:val="18"/>
           <w:szCs w:val="18"/>
         </w:rPr>
-        <w:t xml:space="preserve">  |  </w:t>
-      </w:r>
-      <w:r>
-        <w:rPr>
-          <w:color w:val="1F5FA9"/>
-          <w:sz w:val="18"/>
-          <w:szCs w:val="18"/>
-        </w:rPr>
-        <w:t>linkedin.com/in/phenphitcha-phaisan-30b5a642b</w:t>
+        <w:t xml:space="preserve">  </w:t>
       </w:r>
     </w:p>
     <w:p>
@@ -113,7 +105,7 @@
         </w:pBdr>
         <w:spacing w:before="180" w:after="80"/>
         <w:rPr>
-          <w:rFonts w:cstheme="minorBidi"/>
+          <w:rFonts w:cstheme="minorBidi" w:hint="cs"/>
           <w:cs/>
         </w:rPr>
       </w:pPr>

</xml_diff>